<commit_message>
First commit and  first header
</commit_message>
<xml_diff>
--- a/Modele-de-copie-FRONT-GOMES-Steven.docx
+++ b/Modele-de-copie-FRONT-GOMES-Steven.docx
@@ -176,7 +176,6 @@
                               </w:rPr>
                               <w:tab/>
                             </w:r>
-                            <w:proofErr w:type="gramStart"/>
                             <w:r>
                               <w:rPr>
                                 <w:rFonts w:ascii="Arial" w:eastAsia="Arial" w:hAnsi="Arial" w:cs="Arial"/>
@@ -188,11 +187,7 @@
                               <w:t xml:space="preserve">  </w:t>
                             </w:r>
                             <w:r>
-                              <w:t>Modèle</w:t>
-                            </w:r>
-                            <w:proofErr w:type="gramEnd"/>
-                            <w:r>
-                              <w:t xml:space="preserve"> de copie</w:t>
+                              <w:t>Modèle de copie</w:t>
                             </w:r>
                             <w:r>
                               <w:t xml:space="preserve"> :  </w:t>
@@ -984,6 +979,14 @@
           <w:szCs w:val="21"/>
         </w:rPr>
       </w:pPr>
+      <w:r>
+        <w:rPr>
+          <w:color w:val="000000"/>
+          <w:sz w:val="21"/>
+          <w:szCs w:val="21"/>
+        </w:rPr>
+        <w:t>Utilisation de HTML5 CSS3</w:t>
+      </w:r>
     </w:p>
     <w:p>
       <w:pPr>
@@ -1157,6 +1160,528 @@
           <w:szCs w:val="21"/>
         </w:rPr>
       </w:pPr>
+      <w:r>
+        <w:rPr>
+          <w:color w:val="000000"/>
+          <w:sz w:val="21"/>
+          <w:szCs w:val="21"/>
+        </w:rPr>
+        <w:t xml:space="preserve">J’ai commencé par choisir les couleurs principales en me basent sur la couleur du logo, ensuite j’ai choisi des photos en fonction des catégories </w:t>
+      </w:r>
+      <w:r>
+        <w:rPr>
+          <w:color w:val="000000"/>
+          <w:sz w:val="21"/>
+          <w:szCs w:val="21"/>
+        </w:rPr>
+        <w:t xml:space="preserve">via le site </w:t>
+      </w:r>
+      <w:proofErr w:type="spellStart"/>
+      <w:r>
+        <w:rPr>
+          <w:color w:val="000000"/>
+          <w:sz w:val="21"/>
+          <w:szCs w:val="21"/>
+        </w:rPr>
+        <w:t>Pixabay</w:t>
+      </w:r>
+      <w:proofErr w:type="spellEnd"/>
+      <w:r>
+        <w:rPr>
+          <w:color w:val="000000"/>
+          <w:sz w:val="21"/>
+          <w:szCs w:val="21"/>
+        </w:rPr>
+        <w:t xml:space="preserve">, j’ai classé les photos dans des dossiers. </w:t>
+      </w:r>
+    </w:p>
+    <w:p>
+      <w:pPr>
+        <w:pBdr>
+          <w:top w:val="single" w:sz="4" w:space="1" w:color="auto"/>
+          <w:left w:val="single" w:sz="4" w:space="1" w:color="auto"/>
+          <w:bottom w:val="single" w:sz="4" w:space="1" w:color="auto"/>
+          <w:right w:val="single" w:sz="4" w:space="1" w:color="auto"/>
+          <w:between w:val="nil"/>
+        </w:pBdr>
+        <w:rPr>
+          <w:color w:val="000000"/>
+          <w:sz w:val="21"/>
+          <w:szCs w:val="21"/>
+        </w:rPr>
+      </w:pPr>
+      <w:r>
+        <w:rPr>
+          <w:color w:val="000000"/>
+          <w:sz w:val="21"/>
+          <w:szCs w:val="21"/>
+        </w:rPr>
+        <w:t xml:space="preserve">J’ai utilisé le logiciel </w:t>
+      </w:r>
+      <w:proofErr w:type="spellStart"/>
+      <w:r>
+        <w:rPr>
+          <w:color w:val="000000"/>
+          <w:sz w:val="21"/>
+          <w:szCs w:val="21"/>
+        </w:rPr>
+        <w:t>Figma</w:t>
+      </w:r>
+      <w:proofErr w:type="spellEnd"/>
+      <w:r>
+        <w:rPr>
+          <w:color w:val="000000"/>
+          <w:sz w:val="21"/>
+          <w:szCs w:val="21"/>
+        </w:rPr>
+        <w:t xml:space="preserve"> pour faire mes maquettes version mobile et web, pour la page d’accueil, j’ai commencé par placer le logo récupéré dans l’énoncé en haut à gauche, j’ai défini la taille par défaut. </w:t>
+      </w:r>
+    </w:p>
+    <w:p>
+      <w:pPr>
+        <w:pBdr>
+          <w:top w:val="single" w:sz="4" w:space="1" w:color="auto"/>
+          <w:left w:val="single" w:sz="4" w:space="1" w:color="auto"/>
+          <w:bottom w:val="single" w:sz="4" w:space="1" w:color="auto"/>
+          <w:right w:val="single" w:sz="4" w:space="1" w:color="auto"/>
+          <w:between w:val="nil"/>
+        </w:pBdr>
+        <w:rPr>
+          <w:color w:val="000000"/>
+          <w:sz w:val="21"/>
+          <w:szCs w:val="21"/>
+        </w:rPr>
+      </w:pPr>
+      <w:r>
+        <w:rPr>
+          <w:color w:val="000000"/>
+          <w:sz w:val="21"/>
+          <w:szCs w:val="21"/>
+        </w:rPr>
+        <w:t xml:space="preserve">J’ai ensuite réalisé la barre de navigation en utilisant la couleur </w:t>
+      </w:r>
+      <w:r>
+        <w:rPr>
+          <w:color w:val="000000"/>
+          <w:sz w:val="21"/>
+          <w:szCs w:val="21"/>
+        </w:rPr>
+        <w:t>défini</w:t>
+      </w:r>
+      <w:r>
+        <w:rPr>
+          <w:color w:val="000000"/>
+          <w:sz w:val="21"/>
+          <w:szCs w:val="21"/>
+        </w:rPr>
+        <w:t xml:space="preserve"> pour le background et le texte.</w:t>
+      </w:r>
+    </w:p>
+    <w:p>
+      <w:pPr>
+        <w:pBdr>
+          <w:top w:val="single" w:sz="4" w:space="1" w:color="auto"/>
+          <w:left w:val="single" w:sz="4" w:space="1" w:color="auto"/>
+          <w:bottom w:val="single" w:sz="4" w:space="1" w:color="auto"/>
+          <w:right w:val="single" w:sz="4" w:space="1" w:color="auto"/>
+          <w:between w:val="nil"/>
+        </w:pBdr>
+        <w:rPr>
+          <w:color w:val="000000"/>
+          <w:sz w:val="21"/>
+          <w:szCs w:val="21"/>
+        </w:rPr>
+      </w:pPr>
+      <w:r>
+        <w:rPr>
+          <w:color w:val="000000"/>
+          <w:sz w:val="21"/>
+          <w:szCs w:val="21"/>
+        </w:rPr>
+        <w:t>Pour le texte au centre de la page, j’ai repris la couleur du navigateur mais</w:t>
+      </w:r>
+      <w:r>
+        <w:rPr>
+          <w:color w:val="000000"/>
+          <w:sz w:val="21"/>
+          <w:szCs w:val="21"/>
+        </w:rPr>
+        <w:t xml:space="preserve"> pour</w:t>
+      </w:r>
+      <w:r>
+        <w:rPr>
+          <w:color w:val="000000"/>
+          <w:sz w:val="21"/>
+          <w:szCs w:val="21"/>
+        </w:rPr>
+        <w:t xml:space="preserve"> le texte</w:t>
+      </w:r>
+      <w:r>
+        <w:rPr>
+          <w:color w:val="000000"/>
+          <w:sz w:val="21"/>
+          <w:szCs w:val="21"/>
+        </w:rPr>
+        <w:t xml:space="preserve"> je l’ai défini en blanc avec un ombrage.</w:t>
+      </w:r>
+    </w:p>
+    <w:p>
+      <w:pPr>
+        <w:pBdr>
+          <w:top w:val="single" w:sz="4" w:space="1" w:color="auto"/>
+          <w:left w:val="single" w:sz="4" w:space="1" w:color="auto"/>
+          <w:bottom w:val="single" w:sz="4" w:space="1" w:color="auto"/>
+          <w:right w:val="single" w:sz="4" w:space="1" w:color="auto"/>
+          <w:between w:val="nil"/>
+        </w:pBdr>
+        <w:rPr>
+          <w:color w:val="000000"/>
+          <w:sz w:val="21"/>
+          <w:szCs w:val="21"/>
+        </w:rPr>
+      </w:pPr>
+      <w:r>
+        <w:rPr>
+          <w:color w:val="000000"/>
+          <w:sz w:val="21"/>
+          <w:szCs w:val="21"/>
+        </w:rPr>
+        <w:t>J’ai ensuite créé la page de la galerie, j’ai</w:t>
+      </w:r>
+      <w:r>
+        <w:rPr>
+          <w:color w:val="000000"/>
+          <w:sz w:val="21"/>
+          <w:szCs w:val="21"/>
+        </w:rPr>
+        <w:t xml:space="preserve"> copié mon header et j’ai créé le menu par catégorie simple avec la même police et la même couleur, j’ai positionn</w:t>
+      </w:r>
+      <w:r>
+        <w:rPr>
+          <w:color w:val="000000"/>
+          <w:sz w:val="21"/>
+          <w:szCs w:val="21"/>
+        </w:rPr>
+        <w:t>é un format d’image pour représenter les images à mettre en avant.</w:t>
+      </w:r>
+    </w:p>
+    <w:p>
+      <w:pPr>
+        <w:pBdr>
+          <w:top w:val="single" w:sz="4" w:space="1" w:color="auto"/>
+          <w:left w:val="single" w:sz="4" w:space="1" w:color="auto"/>
+          <w:bottom w:val="single" w:sz="4" w:space="1" w:color="auto"/>
+          <w:right w:val="single" w:sz="4" w:space="1" w:color="auto"/>
+          <w:between w:val="nil"/>
+        </w:pBdr>
+        <w:rPr>
+          <w:color w:val="000000"/>
+          <w:sz w:val="21"/>
+          <w:szCs w:val="21"/>
+        </w:rPr>
+      </w:pPr>
+      <w:r>
+        <w:rPr>
+          <w:color w:val="000000"/>
+          <w:sz w:val="21"/>
+          <w:szCs w:val="21"/>
+        </w:rPr>
+        <w:t>Pour la page tarifs et prestations, j’ai aussi copié le header, j’ai créé une fiche de tarif avec le rappel de couleur avec une image en superposition.</w:t>
+      </w:r>
+    </w:p>
+    <w:p>
+      <w:pPr>
+        <w:pBdr>
+          <w:top w:val="single" w:sz="4" w:space="1" w:color="auto"/>
+          <w:left w:val="single" w:sz="4" w:space="1" w:color="auto"/>
+          <w:bottom w:val="single" w:sz="4" w:space="1" w:color="auto"/>
+          <w:right w:val="single" w:sz="4" w:space="1" w:color="auto"/>
+          <w:between w:val="nil"/>
+        </w:pBdr>
+        <w:rPr>
+          <w:color w:val="000000"/>
+          <w:sz w:val="21"/>
+          <w:szCs w:val="21"/>
+        </w:rPr>
+      </w:pPr>
+      <w:r>
+        <w:rPr>
+          <w:color w:val="000000"/>
+          <w:sz w:val="21"/>
+          <w:szCs w:val="21"/>
+        </w:rPr>
+        <w:t>Pour la page contact, j’ai créé un formulaire basique avec le rappel de couleur.</w:t>
+      </w:r>
+    </w:p>
+    <w:p>
+      <w:pPr>
+        <w:pBdr>
+          <w:top w:val="single" w:sz="4" w:space="1" w:color="auto"/>
+          <w:left w:val="single" w:sz="4" w:space="1" w:color="auto"/>
+          <w:bottom w:val="single" w:sz="4" w:space="1" w:color="auto"/>
+          <w:right w:val="single" w:sz="4" w:space="1" w:color="auto"/>
+          <w:between w:val="nil"/>
+        </w:pBdr>
+        <w:rPr>
+          <w:color w:val="000000"/>
+          <w:sz w:val="21"/>
+          <w:szCs w:val="21"/>
+        </w:rPr>
+      </w:pPr>
+      <w:r>
+        <w:rPr>
+          <w:color w:val="000000"/>
+          <w:sz w:val="21"/>
+          <w:szCs w:val="21"/>
+        </w:rPr>
+        <w:t xml:space="preserve">J’ai ensuite créé les maquettes au format mobile en utilisant le format du </w:t>
+      </w:r>
+      <w:proofErr w:type="spellStart"/>
+      <w:r>
+        <w:rPr>
+          <w:color w:val="000000"/>
+          <w:sz w:val="21"/>
+          <w:szCs w:val="21"/>
+        </w:rPr>
+        <w:t>samsung</w:t>
+      </w:r>
+      <w:proofErr w:type="spellEnd"/>
+      <w:r>
+        <w:rPr>
+          <w:color w:val="000000"/>
+          <w:sz w:val="21"/>
+          <w:szCs w:val="21"/>
+        </w:rPr>
+        <w:t xml:space="preserve"> </w:t>
+      </w:r>
+      <w:proofErr w:type="spellStart"/>
+      <w:r>
+        <w:rPr>
+          <w:color w:val="000000"/>
+          <w:sz w:val="21"/>
+          <w:szCs w:val="21"/>
+        </w:rPr>
+        <w:t>galaxy</w:t>
+      </w:r>
+      <w:proofErr w:type="spellEnd"/>
+      <w:r>
+        <w:rPr>
+          <w:color w:val="000000"/>
+          <w:sz w:val="21"/>
+          <w:szCs w:val="21"/>
+        </w:rPr>
+        <w:t xml:space="preserve"> s20 ultra.</w:t>
+      </w:r>
+    </w:p>
+    <w:p>
+      <w:pPr>
+        <w:pBdr>
+          <w:top w:val="single" w:sz="4" w:space="1" w:color="auto"/>
+          <w:left w:val="single" w:sz="4" w:space="1" w:color="auto"/>
+          <w:bottom w:val="single" w:sz="4" w:space="1" w:color="auto"/>
+          <w:right w:val="single" w:sz="4" w:space="1" w:color="auto"/>
+          <w:between w:val="nil"/>
+        </w:pBdr>
+        <w:rPr>
+          <w:color w:val="000000"/>
+          <w:sz w:val="21"/>
+          <w:szCs w:val="21"/>
+        </w:rPr>
+      </w:pPr>
+      <w:r>
+        <w:rPr>
+          <w:color w:val="000000"/>
+          <w:sz w:val="21"/>
+          <w:szCs w:val="21"/>
+        </w:rPr>
+        <w:t>J’ai copié mes éléments et ensuite j’ai adapté le header en centrant le logo en haut de page, en créant un bouton menu et en centrant le texte de la page d’accueil.</w:t>
+      </w:r>
+    </w:p>
+    <w:p>
+      <w:pPr>
+        <w:pBdr>
+          <w:top w:val="single" w:sz="4" w:space="1" w:color="auto"/>
+          <w:left w:val="single" w:sz="4" w:space="1" w:color="auto"/>
+          <w:bottom w:val="single" w:sz="4" w:space="1" w:color="auto"/>
+          <w:right w:val="single" w:sz="4" w:space="1" w:color="auto"/>
+          <w:between w:val="nil"/>
+        </w:pBdr>
+        <w:rPr>
+          <w:color w:val="000000"/>
+          <w:sz w:val="21"/>
+          <w:szCs w:val="21"/>
+        </w:rPr>
+      </w:pPr>
+      <w:r>
+        <w:rPr>
+          <w:color w:val="000000"/>
+          <w:sz w:val="21"/>
+          <w:szCs w:val="21"/>
+        </w:rPr>
+        <w:t>Pour la page de la galerie</w:t>
+      </w:r>
+      <w:r>
+        <w:rPr>
+          <w:color w:val="000000"/>
+          <w:sz w:val="21"/>
+          <w:szCs w:val="21"/>
+        </w:rPr>
+        <w:t>, j’ai centré les images et créé un bouton menu</w:t>
+      </w:r>
+      <w:r>
+        <w:rPr>
+          <w:color w:val="000000"/>
+          <w:sz w:val="21"/>
+          <w:szCs w:val="21"/>
+        </w:rPr>
+        <w:t xml:space="preserve"> </w:t>
+      </w:r>
+      <w:r>
+        <w:rPr>
+          <w:color w:val="000000"/>
+          <w:sz w:val="21"/>
+          <w:szCs w:val="21"/>
+        </w:rPr>
+        <w:t>pour filtrer les catégories.</w:t>
+      </w:r>
+    </w:p>
+    <w:p>
+      <w:pPr>
+        <w:pBdr>
+          <w:top w:val="single" w:sz="4" w:space="1" w:color="auto"/>
+          <w:left w:val="single" w:sz="4" w:space="1" w:color="auto"/>
+          <w:bottom w:val="single" w:sz="4" w:space="1" w:color="auto"/>
+          <w:right w:val="single" w:sz="4" w:space="1" w:color="auto"/>
+          <w:between w:val="nil"/>
+        </w:pBdr>
+        <w:rPr>
+          <w:color w:val="000000"/>
+          <w:sz w:val="21"/>
+          <w:szCs w:val="21"/>
+        </w:rPr>
+      </w:pPr>
+      <w:r>
+        <w:rPr>
+          <w:color w:val="000000"/>
+          <w:sz w:val="21"/>
+          <w:szCs w:val="21"/>
+        </w:rPr>
+        <w:t xml:space="preserve">Pour la page de contact, </w:t>
+      </w:r>
+      <w:r>
+        <w:rPr>
+          <w:color w:val="000000"/>
+          <w:sz w:val="21"/>
+          <w:szCs w:val="21"/>
+        </w:rPr>
+        <w:t xml:space="preserve">j’ai centré le </w:t>
+      </w:r>
+      <w:r>
+        <w:rPr>
+          <w:color w:val="000000"/>
+          <w:sz w:val="21"/>
+          <w:szCs w:val="21"/>
+        </w:rPr>
+        <w:t>formulaire</w:t>
+      </w:r>
+      <w:r>
+        <w:rPr>
+          <w:color w:val="000000"/>
+          <w:sz w:val="21"/>
+          <w:szCs w:val="21"/>
+        </w:rPr>
+        <w:t>.</w:t>
+      </w:r>
+    </w:p>
+    <w:p>
+      <w:pPr>
+        <w:pBdr>
+          <w:top w:val="single" w:sz="4" w:space="1" w:color="auto"/>
+          <w:left w:val="single" w:sz="4" w:space="1" w:color="auto"/>
+          <w:bottom w:val="single" w:sz="4" w:space="1" w:color="auto"/>
+          <w:right w:val="single" w:sz="4" w:space="1" w:color="auto"/>
+          <w:between w:val="nil"/>
+        </w:pBdr>
+        <w:rPr>
+          <w:color w:val="000000"/>
+          <w:sz w:val="21"/>
+          <w:szCs w:val="21"/>
+        </w:rPr>
+      </w:pPr>
+      <w:r>
+        <w:rPr>
+          <w:color w:val="000000"/>
+          <w:sz w:val="21"/>
+          <w:szCs w:val="21"/>
+        </w:rPr>
+        <w:t xml:space="preserve">J’ai exporté les images au format </w:t>
+      </w:r>
+      <w:proofErr w:type="spellStart"/>
+      <w:r>
+        <w:rPr>
+          <w:color w:val="000000"/>
+          <w:sz w:val="21"/>
+          <w:szCs w:val="21"/>
+        </w:rPr>
+        <w:t>pdf</w:t>
+      </w:r>
+      <w:proofErr w:type="spellEnd"/>
+      <w:r>
+        <w:rPr>
+          <w:color w:val="000000"/>
+          <w:sz w:val="21"/>
+          <w:szCs w:val="21"/>
+        </w:rPr>
+        <w:t>.</w:t>
+      </w:r>
+    </w:p>
+    <w:p>
+      <w:pPr>
+        <w:pBdr>
+          <w:top w:val="single" w:sz="4" w:space="1" w:color="auto"/>
+          <w:left w:val="single" w:sz="4" w:space="1" w:color="auto"/>
+          <w:bottom w:val="single" w:sz="4" w:space="1" w:color="auto"/>
+          <w:right w:val="single" w:sz="4" w:space="1" w:color="auto"/>
+          <w:between w:val="nil"/>
+        </w:pBdr>
+        <w:rPr>
+          <w:color w:val="000000"/>
+          <w:sz w:val="21"/>
+          <w:szCs w:val="21"/>
+        </w:rPr>
+      </w:pPr>
+      <w:r>
+        <w:rPr>
+          <w:color w:val="000000"/>
+          <w:sz w:val="21"/>
+          <w:szCs w:val="21"/>
+        </w:rPr>
+        <w:t xml:space="preserve">J’ai créé ensuite mon git et mon dossier pour commencer à développer la page d’accueil, </w:t>
+      </w:r>
+    </w:p>
+    <w:p>
+      <w:pPr>
+        <w:pBdr>
+          <w:top w:val="single" w:sz="4" w:space="1" w:color="auto"/>
+          <w:left w:val="single" w:sz="4" w:space="1" w:color="auto"/>
+          <w:bottom w:val="single" w:sz="4" w:space="1" w:color="auto"/>
+          <w:right w:val="single" w:sz="4" w:space="1" w:color="auto"/>
+          <w:between w:val="nil"/>
+        </w:pBdr>
+        <w:rPr>
+          <w:color w:val="000000"/>
+          <w:sz w:val="21"/>
+          <w:szCs w:val="21"/>
+        </w:rPr>
+      </w:pPr>
+      <w:r>
+        <w:rPr>
+          <w:color w:val="000000"/>
+          <w:sz w:val="21"/>
+          <w:szCs w:val="21"/>
+        </w:rPr>
+        <w:t xml:space="preserve">  </w:t>
+      </w:r>
     </w:p>
     <w:p>
       <w:pPr>
@@ -1927,7 +2452,6 @@
           <w:sz w:val="21"/>
           <w:szCs w:val="21"/>
         </w:rPr>
-        <w:lastRenderedPageBreak/>
         <w:t>Description de la veille, effectuée par le candidat durant le projet, sur les vulnérabilités de sécurité</w:t>
       </w:r>
     </w:p>
@@ -2432,6 +2956,7 @@
           <w:sz w:val="21"/>
           <w:szCs w:val="21"/>
         </w:rPr>
+        <w:lastRenderedPageBreak/>
         <w:t>Extrait du site anglophone, utilisé dans le cadre de la recherche décrite précédemment, accompagné de la traduction en français effectuée par le candidat sans traducteur automatique (environ 750 signes).</w:t>
       </w:r>
     </w:p>
@@ -2748,7 +3273,6 @@
           <w:sz w:val="21"/>
           <w:szCs w:val="21"/>
         </w:rPr>
-        <w:lastRenderedPageBreak/>
         <w:t>Autres ressources</w:t>
       </w:r>
     </w:p>
@@ -3405,7 +3929,6 @@
       </w:rPr>
       <w:t xml:space="preserve"> - Reproduction interdite </w:t>
     </w:r>
-    <w:proofErr w:type="gramStart"/>
     <w:r>
       <w:rPr>
         <w:sz w:val="22"/>
@@ -3421,7 +3944,6 @@
       </w:rPr>
       <w:t>GDDWWMECFENTRIII</w:t>
     </w:r>
-    <w:proofErr w:type="gramEnd"/>
     <w:r>
       <w:rPr>
         <w:sz w:val="22"/>

</xml_diff>